<commit_message>
Upd link commit Week1
</commit_message>
<xml_diff>
--- a/Week01/Week01_BaoCaoNhom.docx
+++ b/Week01/Week01_BaoCaoNhom.docx
@@ -3304,15 +3304,15 @@
                 <w:sz w:val="24"/>
                 <w:szCs w:val="24"/>
               </w:rPr>
-              <w:t>[</w:t>
-            </w:r>
-            <w:proofErr w:type="spellStart"/>
-            <w:r>
-              <w:rPr>
-                <w:sz w:val="24"/>
-                <w:szCs w:val="24"/>
-              </w:rPr>
-              <w:t>Họ</w:t>
+              <w:t xml:space="preserve">Nguyễn </w:t>
+            </w:r>
+            <w:proofErr w:type="spellStart"/>
+            <w:r>
+              <w:rPr>
+                <w:sz w:val="24"/>
+                <w:szCs w:val="24"/>
+              </w:rPr>
+              <w:t>Hữu</w:t>
             </w:r>
             <w:proofErr w:type="spellEnd"/>
             <w:r>
@@ -3328,7 +3328,7 @@
                 <w:sz w:val="24"/>
                 <w:szCs w:val="24"/>
               </w:rPr>
-              <w:t>và</w:t>
+              <w:t>Tấn</w:t>
             </w:r>
             <w:proofErr w:type="spellEnd"/>
             <w:r>
@@ -3344,48 +3344,9 @@
                 <w:sz w:val="24"/>
                 <w:szCs w:val="24"/>
               </w:rPr>
-              <w:t>tên</w:t>
-            </w:r>
-            <w:proofErr w:type="spellEnd"/>
-            <w:r>
-              <w:rPr>
-                <w:sz w:val="24"/>
-                <w:szCs w:val="24"/>
-              </w:rPr>
-              <w:t xml:space="preserve"> </w:t>
-            </w:r>
-            <w:proofErr w:type="spellStart"/>
-            <w:r>
-              <w:rPr>
-                <w:sz w:val="24"/>
-                <w:szCs w:val="24"/>
-              </w:rPr>
-              <w:t>thành</w:t>
-            </w:r>
-            <w:proofErr w:type="spellEnd"/>
-            <w:r>
-              <w:rPr>
-                <w:sz w:val="24"/>
-                <w:szCs w:val="24"/>
-              </w:rPr>
-              <w:t xml:space="preserve"> </w:t>
-            </w:r>
-            <w:proofErr w:type="spellStart"/>
-            <w:r>
-              <w:rPr>
-                <w:sz w:val="24"/>
-                <w:szCs w:val="24"/>
-              </w:rPr>
-              <w:t>viên</w:t>
-            </w:r>
-            <w:proofErr w:type="spellEnd"/>
-            <w:r>
-              <w:rPr>
-                <w:sz w:val="24"/>
-                <w:szCs w:val="24"/>
-              </w:rPr>
-              <w:t>]</w:t>
-            </w:r>
+              <w:t>Đạt</w:t>
+            </w:r>
+            <w:proofErr w:type="spellEnd"/>
           </w:p>
         </w:tc>
       </w:tr>
@@ -3472,7 +3433,7 @@
                 <w:sz w:val="24"/>
                 <w:szCs w:val="24"/>
               </w:rPr>
-              <w:t>[https://github.com/.../commits/...]</w:t>
+              <w:t>https://github.com/fudn-traltb-su26/rbl-fer202-theotuan-team_1/commits/main/</w:t>
             </w:r>
           </w:p>
         </w:tc>
@@ -5922,6 +5883,7 @@
           <w:iCs/>
           <w:color w:val="AAB7C4"/>
         </w:rPr>
+        <w:lastRenderedPageBreak/>
         <w:t>[</w:t>
       </w:r>
       <w:proofErr w:type="spellStart"/>
@@ -6848,10 +6810,7 @@
       </w:r>
       <w:proofErr w:type="spellStart"/>
       <w:r>
-        <w:t>K</w:t>
-      </w:r>
-      <w:r>
-        <w:t>hởi</w:t>
+        <w:t>Khởi</w:t>
       </w:r>
       <w:proofErr w:type="spellEnd"/>
       <w:r>
@@ -7986,10 +7945,7 @@
       </w:r>
       <w:proofErr w:type="spellStart"/>
       <w:r>
-        <w:t>G</w:t>
-      </w:r>
-      <w:r>
-        <w:t>hi</w:t>
+        <w:t>Ghi</w:t>
       </w:r>
       <w:proofErr w:type="spellEnd"/>
       <w:r>
@@ -8783,10 +8739,7 @@
         <w:t xml:space="preserve"> — </w:t>
       </w:r>
       <w:r>
-        <w:t>https://github.com/fudn-traltb-su26/rbl-fer202-theotuan-team_1</w:t>
-      </w:r>
-      <w:r>
-        <w:t xml:space="preserve"> </w:t>
+        <w:t xml:space="preserve">https://github.com/fudn-traltb-su26/rbl-fer202-theotuan-team_1 </w:t>
       </w:r>
     </w:p>
     <w:p>
@@ -9417,6 +9370,7 @@
         <w:pStyle w:val="Heading2"/>
       </w:pPr>
       <w:r>
+        <w:lastRenderedPageBreak/>
         <w:t xml:space="preserve">4.2. Screenshot / Demo </w:t>
       </w:r>
       <w:proofErr w:type="spellStart"/>
@@ -9444,7 +9398,6 @@
           <w:iCs/>
           <w:color w:val="7F8C8D"/>
         </w:rPr>
-        <w:lastRenderedPageBreak/>
         <w:t>Chèn</w:t>
       </w:r>
       <w:proofErr w:type="spellEnd"/>
@@ -9862,6 +9815,7 @@
               <w:rPr>
                 <w:i/>
                 <w:iCs/>
+                <w:noProof/>
                 <w:color w:val="AAB7C4"/>
                 <w:sz w:val="22"/>
                 <w:szCs w:val="22"/>
@@ -10047,6 +10001,7 @@
               <w:rPr>
                 <w:i/>
                 <w:iCs/>
+                <w:noProof/>
                 <w:color w:val="AAB7C4"/>
                 <w:sz w:val="22"/>
                 <w:szCs w:val="22"/>
@@ -10117,25 +10072,7 @@
                 <w:sz w:val="22"/>
                 <w:szCs w:val="22"/>
               </w:rPr>
-              <w:t xml:space="preserve"> </w:t>
-            </w:r>
-            <w:r>
-              <w:rPr>
-                <w:i/>
-                <w:iCs/>
-                <w:sz w:val="22"/>
-                <w:szCs w:val="22"/>
-              </w:rPr>
-              <w:t>2</w:t>
-            </w:r>
-            <w:r>
-              <w:rPr>
-                <w:i/>
-                <w:iCs/>
-                <w:sz w:val="22"/>
-                <w:szCs w:val="22"/>
-              </w:rPr>
-              <w:t xml:space="preserve">: </w:t>
+              <w:t xml:space="preserve"> 2: </w:t>
             </w:r>
             <w:proofErr w:type="spellStart"/>
             <w:r>

</xml_diff>

<commit_message>
Upd src code, chinh sua lai w1 w2
</commit_message>
<xml_diff>
--- a/Week01/Week01_BaoCaoNhom.docx
+++ b/Week01/Week01_BaoCaoNhom.docx
@@ -301,7 +301,7 @@
           <w:sz w:val="24"/>
           <w:szCs w:val="24"/>
         </w:rPr>
-        <w:t>ReadMore</w:t>
+        <w:t>TicketNow</w:t>
       </w:r>
       <w:proofErr w:type="spellEnd"/>
       <w:r>
@@ -311,7 +311,7 @@
           <w:sz w:val="24"/>
           <w:szCs w:val="24"/>
         </w:rPr>
-        <w:t xml:space="preserve"> Bookstore — </w:t>
+        <w:t xml:space="preserve"> — </w:t>
       </w:r>
       <w:proofErr w:type="spellStart"/>
       <w:r>
@@ -321,7 +321,7 @@
           <w:sz w:val="24"/>
           <w:szCs w:val="24"/>
         </w:rPr>
-        <w:t>Nhà</w:t>
+        <w:t>Đặt</w:t>
       </w:r>
       <w:proofErr w:type="spellEnd"/>
       <w:r>
@@ -341,7 +341,7 @@
           <w:sz w:val="24"/>
           <w:szCs w:val="24"/>
         </w:rPr>
-        <w:t>sách</w:t>
+        <w:t>vé</w:t>
       </w:r>
       <w:proofErr w:type="spellEnd"/>
       <w:r>
@@ -9759,15 +9759,16 @@
     </w:p>
     <w:tbl>
       <w:tblPr>
-        <w:tblW w:w="9026" w:type="dxa"/>
+        <w:tblW w:w="9527" w:type="dxa"/>
         <w:tblBorders>
-          <w:top w:val="single" w:sz="4" w:space="0" w:color="auto"/>
-          <w:left w:val="single" w:sz="4" w:space="0" w:color="auto"/>
+          <w:top w:val="single" w:sz="2" w:space="0" w:color="AAB7C4"/>
+          <w:left w:val="single" w:sz="2" w:space="0" w:color="AAB7C4"/>
           <w:bottom w:val="single" w:sz="4" w:space="0" w:color="auto"/>
-          <w:right w:val="single" w:sz="4" w:space="0" w:color="auto"/>
-          <w:insideH w:val="single" w:sz="4" w:space="0" w:color="auto"/>
-          <w:insideV w:val="single" w:sz="4" w:space="0" w:color="auto"/>
+          <w:right w:val="single" w:sz="2" w:space="0" w:color="AAB7C4"/>
+          <w:insideH w:val="single" w:sz="2" w:space="0" w:color="AAB7C4"/>
+          <w:insideV w:val="single" w:sz="2" w:space="0" w:color="AAB7C4"/>
         </w:tblBorders>
+        <w:tblLayout w:type="fixed"/>
         <w:tblCellMar>
           <w:left w:w="10" w:type="dxa"/>
           <w:right w:w="10" w:type="dxa"/>
@@ -9775,19 +9776,19 @@
         <w:tblLook w:val="0000" w:firstRow="0" w:lastRow="0" w:firstColumn="0" w:lastColumn="0" w:noHBand="0" w:noVBand="0"/>
       </w:tblPr>
       <w:tblGrid>
-        <w:gridCol w:w="2934"/>
-        <w:gridCol w:w="6419"/>
+        <w:gridCol w:w="3709"/>
+        <w:gridCol w:w="5558"/>
+        <w:gridCol w:w="82"/>
+        <w:gridCol w:w="178"/>
       </w:tblGrid>
       <w:tr>
+        <w:trPr>
+          <w:gridAfter w:val="1"/>
+          <w:wAfter w:w="178" w:type="dxa"/>
+        </w:trPr>
         <w:tc>
           <w:tcPr>
-            <w:tcW w:w="4500" w:type="dxa"/>
-            <w:tcBorders>
-              <w:top w:val="single" w:sz="1" w:space="0" w:color="AAB7C4"/>
-              <w:left w:val="single" w:sz="1" w:space="0" w:color="AAB7C4"/>
-              <w:bottom w:val="single" w:sz="1" w:space="0" w:color="AAB7C4"/>
-              <w:right w:val="single" w:sz="1" w:space="0" w:color="AAB7C4"/>
-            </w:tcBorders>
+            <w:tcW w:w="3709" w:type="dxa"/>
             <w:shd w:val="clear" w:color="auto" w:fill="F4F6F8"/>
             <w:tcMar>
               <w:top w:w="80" w:type="dxa"/>
@@ -9809,208 +9810,11 @@
                 <w:sz w:val="22"/>
                 <w:szCs w:val="22"/>
               </w:rPr>
-              <w:t>[</w:t>
-            </w:r>
-            <w:r>
-              <w:rPr>
-                <w:i/>
-                <w:iCs/>
-                <w:noProof/>
-                <w:color w:val="AAB7C4"/>
-                <w:sz w:val="22"/>
-                <w:szCs w:val="22"/>
-              </w:rPr>
               <w:drawing>
-                <wp:inline distT="0" distB="0" distL="0" distR="0" wp14:anchorId="02F7D69F" wp14:editId="78F1551E">
-                  <wp:extent cx="2591162" cy="4182059"/>
-                  <wp:effectExtent l="0" t="0" r="0" b="9525"/>
+                <wp:inline distT="0" distB="0" distL="0" distR="0" wp14:anchorId="38A64337" wp14:editId="5D6D708B">
+                  <wp:extent cx="1819529" cy="6544588"/>
+                  <wp:effectExtent l="0" t="0" r="9525" b="0"/>
                   <wp:docPr id="1" name="Picture 1"/>
-                  <wp:cNvGraphicFramePr>
-                    <a:graphicFrameLocks xmlns:a="http://schemas.openxmlformats.org/drawingml/2006/main" noChangeAspect="1"/>
-                  </wp:cNvGraphicFramePr>
-                  <a:graphic xmlns:a="http://schemas.openxmlformats.org/drawingml/2006/main">
-                    <a:graphicData uri="http://schemas.openxmlformats.org/drawingml/2006/picture">
-                      <pic:pic xmlns:pic="http://schemas.openxmlformats.org/drawingml/2006/picture">
-                        <pic:nvPicPr>
-                          <pic:cNvPr id="1" name=""/>
-                          <pic:cNvPicPr/>
-                        </pic:nvPicPr>
-                        <pic:blipFill>
-                          <a:blip r:embed="rId7"/>
-                          <a:stretch>
-                            <a:fillRect/>
-                          </a:stretch>
-                        </pic:blipFill>
-                        <pic:spPr>
-                          <a:xfrm>
-                            <a:off x="0" y="0"/>
-                            <a:ext cx="2591162" cy="4182059"/>
-                          </a:xfrm>
-                          <a:prstGeom prst="rect">
-                            <a:avLst/>
-                          </a:prstGeom>
-                        </pic:spPr>
-                      </pic:pic>
-                    </a:graphicData>
-                  </a:graphic>
-                </wp:inline>
-              </w:drawing>
-            </w:r>
-            <w:proofErr w:type="spellStart"/>
-            <w:r>
-              <w:rPr>
-                <w:i/>
-                <w:iCs/>
-                <w:sz w:val="22"/>
-                <w:szCs w:val="22"/>
-              </w:rPr>
-              <w:t>Hình</w:t>
-            </w:r>
-            <w:proofErr w:type="spellEnd"/>
-            <w:r>
-              <w:rPr>
-                <w:i/>
-                <w:iCs/>
-                <w:sz w:val="22"/>
-                <w:szCs w:val="22"/>
-              </w:rPr>
-              <w:t xml:space="preserve"> 1: </w:t>
-            </w:r>
-            <w:proofErr w:type="spellStart"/>
-            <w:r>
-              <w:rPr>
-                <w:i/>
-                <w:iCs/>
-                <w:sz w:val="22"/>
-                <w:szCs w:val="22"/>
-              </w:rPr>
-              <w:t>Tạo</w:t>
-            </w:r>
-            <w:proofErr w:type="spellEnd"/>
-            <w:r>
-              <w:rPr>
-                <w:i/>
-                <w:iCs/>
-                <w:sz w:val="22"/>
-                <w:szCs w:val="22"/>
-              </w:rPr>
-              <w:t xml:space="preserve"> project – </w:t>
-            </w:r>
-            <w:proofErr w:type="spellStart"/>
-            <w:r>
-              <w:rPr>
-                <w:i/>
-                <w:iCs/>
-                <w:sz w:val="22"/>
-                <w:szCs w:val="22"/>
-              </w:rPr>
-              <w:t>cấu</w:t>
-            </w:r>
-            <w:proofErr w:type="spellEnd"/>
-            <w:r>
-              <w:rPr>
-                <w:i/>
-                <w:iCs/>
-                <w:sz w:val="22"/>
-                <w:szCs w:val="22"/>
-              </w:rPr>
-              <w:t xml:space="preserve"> </w:t>
-            </w:r>
-            <w:proofErr w:type="spellStart"/>
-            <w:r>
-              <w:rPr>
-                <w:i/>
-                <w:iCs/>
-                <w:sz w:val="22"/>
-                <w:szCs w:val="22"/>
-              </w:rPr>
-              <w:t>trúc</w:t>
-            </w:r>
-            <w:proofErr w:type="spellEnd"/>
-            <w:r>
-              <w:rPr>
-                <w:i/>
-                <w:iCs/>
-                <w:sz w:val="22"/>
-                <w:szCs w:val="22"/>
-              </w:rPr>
-              <w:t xml:space="preserve"> </w:t>
-            </w:r>
-            <w:proofErr w:type="spellStart"/>
-            <w:r>
-              <w:rPr>
-                <w:i/>
-                <w:iCs/>
-                <w:sz w:val="22"/>
-                <w:szCs w:val="22"/>
-              </w:rPr>
-              <w:t>thư</w:t>
-            </w:r>
-            <w:proofErr w:type="spellEnd"/>
-            <w:r>
-              <w:rPr>
-                <w:i/>
-                <w:iCs/>
-                <w:sz w:val="22"/>
-                <w:szCs w:val="22"/>
-              </w:rPr>
-              <w:t xml:space="preserve"> </w:t>
-            </w:r>
-            <w:proofErr w:type="spellStart"/>
-            <w:r>
-              <w:rPr>
-                <w:i/>
-                <w:iCs/>
-                <w:sz w:val="22"/>
-                <w:szCs w:val="22"/>
-              </w:rPr>
-              <w:t>mục</w:t>
-            </w:r>
-            <w:proofErr w:type="spellEnd"/>
-          </w:p>
-        </w:tc>
-        <w:tc>
-          <w:tcPr>
-            <w:tcW w:w="4526" w:type="dxa"/>
-            <w:tcBorders>
-              <w:top w:val="single" w:sz="1" w:space="0" w:color="AAB7C4"/>
-              <w:left w:val="single" w:sz="1" w:space="0" w:color="AAB7C4"/>
-              <w:bottom w:val="single" w:sz="1" w:space="0" w:color="AAB7C4"/>
-              <w:right w:val="single" w:sz="1" w:space="0" w:color="AAB7C4"/>
-            </w:tcBorders>
-            <w:shd w:val="clear" w:color="auto" w:fill="F4F6F8"/>
-            <w:tcMar>
-              <w:top w:w="80" w:type="dxa"/>
-              <w:left w:w="120" w:type="dxa"/>
-              <w:bottom w:w="80" w:type="dxa"/>
-              <w:right w:w="120" w:type="dxa"/>
-            </w:tcMar>
-          </w:tcPr>
-          <w:p>
-            <w:pPr>
-              <w:spacing w:before="1200" w:after="80"/>
-              <w:jc w:val="center"/>
-              <w:rPr>
-                <w:i/>
-                <w:iCs/>
-                <w:sz w:val="22"/>
-                <w:szCs w:val="22"/>
-              </w:rPr>
-            </w:pPr>
-            <w:r>
-              <w:rPr>
-                <w:i/>
-                <w:iCs/>
-                <w:noProof/>
-                <w:color w:val="AAB7C4"/>
-                <w:sz w:val="22"/>
-                <w:szCs w:val="22"/>
-              </w:rPr>
-              <w:drawing>
-                <wp:inline distT="0" distB="0" distL="0" distR="0" wp14:anchorId="3F68C31B" wp14:editId="3111B71B">
-                  <wp:extent cx="5940425" cy="3799205"/>
-                  <wp:effectExtent l="0" t="0" r="3175" b="0"/>
-                  <wp:docPr id="2" name="Picture 2"/>
                   <wp:cNvGraphicFramePr>
                     <a:graphicFrameLocks xmlns:a="http://schemas.openxmlformats.org/drawingml/2006/main" noChangeAspect="1"/>
                   </wp:cNvGraphicFramePr>
@@ -10030,7 +9834,7 @@
                         <pic:spPr>
                           <a:xfrm>
                             <a:off x="0" y="0"/>
-                            <a:ext cx="5940425" cy="3799205"/>
+                            <a:ext cx="1819529" cy="6544588"/>
                           </a:xfrm>
                           <a:prstGeom prst="rect">
                             <a:avLst/>
@@ -10042,6 +9846,205 @@
                 </wp:inline>
               </w:drawing>
             </w:r>
+            <w:r>
+              <w:rPr>
+                <w:i/>
+                <w:iCs/>
+                <w:color w:val="AAB7C4"/>
+                <w:sz w:val="22"/>
+                <w:szCs w:val="22"/>
+              </w:rPr>
+              <w:t xml:space="preserve"> </w:t>
+            </w:r>
+            <w:r>
+              <w:rPr>
+                <w:i/>
+                <w:iCs/>
+                <w:color w:val="AAB7C4"/>
+                <w:sz w:val="22"/>
+                <w:szCs w:val="22"/>
+              </w:rPr>
+              <w:t>[</w:t>
+            </w:r>
+            <w:proofErr w:type="spellStart"/>
+            <w:r>
+              <w:rPr>
+                <w:i/>
+                <w:iCs/>
+                <w:sz w:val="22"/>
+                <w:szCs w:val="22"/>
+              </w:rPr>
+              <w:t>Hình</w:t>
+            </w:r>
+            <w:proofErr w:type="spellEnd"/>
+            <w:r>
+              <w:rPr>
+                <w:i/>
+                <w:iCs/>
+                <w:sz w:val="22"/>
+                <w:szCs w:val="22"/>
+              </w:rPr>
+              <w:t xml:space="preserve"> 1: </w:t>
+            </w:r>
+            <w:proofErr w:type="spellStart"/>
+            <w:r>
+              <w:rPr>
+                <w:i/>
+                <w:iCs/>
+                <w:sz w:val="22"/>
+                <w:szCs w:val="22"/>
+              </w:rPr>
+              <w:t>Tạo</w:t>
+            </w:r>
+            <w:proofErr w:type="spellEnd"/>
+            <w:r>
+              <w:rPr>
+                <w:i/>
+                <w:iCs/>
+                <w:sz w:val="22"/>
+                <w:szCs w:val="22"/>
+              </w:rPr>
+              <w:t xml:space="preserve"> project – </w:t>
+            </w:r>
+            <w:proofErr w:type="spellStart"/>
+            <w:r>
+              <w:rPr>
+                <w:i/>
+                <w:iCs/>
+                <w:sz w:val="22"/>
+                <w:szCs w:val="22"/>
+              </w:rPr>
+              <w:t>cấu</w:t>
+            </w:r>
+            <w:proofErr w:type="spellEnd"/>
+            <w:r>
+              <w:rPr>
+                <w:i/>
+                <w:iCs/>
+                <w:sz w:val="22"/>
+                <w:szCs w:val="22"/>
+              </w:rPr>
+              <w:t xml:space="preserve"> </w:t>
+            </w:r>
+            <w:proofErr w:type="spellStart"/>
+            <w:r>
+              <w:rPr>
+                <w:i/>
+                <w:iCs/>
+                <w:sz w:val="22"/>
+                <w:szCs w:val="22"/>
+              </w:rPr>
+              <w:t>trúc</w:t>
+            </w:r>
+            <w:proofErr w:type="spellEnd"/>
+            <w:r>
+              <w:rPr>
+                <w:i/>
+                <w:iCs/>
+                <w:sz w:val="22"/>
+                <w:szCs w:val="22"/>
+              </w:rPr>
+              <w:t xml:space="preserve"> </w:t>
+            </w:r>
+            <w:proofErr w:type="spellStart"/>
+            <w:r>
+              <w:rPr>
+                <w:i/>
+                <w:iCs/>
+                <w:sz w:val="22"/>
+                <w:szCs w:val="22"/>
+              </w:rPr>
+              <w:t>thư</w:t>
+            </w:r>
+            <w:proofErr w:type="spellEnd"/>
+            <w:r>
+              <w:rPr>
+                <w:i/>
+                <w:iCs/>
+                <w:sz w:val="22"/>
+                <w:szCs w:val="22"/>
+              </w:rPr>
+              <w:t xml:space="preserve"> </w:t>
+            </w:r>
+            <w:proofErr w:type="spellStart"/>
+            <w:r>
+              <w:rPr>
+                <w:i/>
+                <w:iCs/>
+                <w:sz w:val="22"/>
+                <w:szCs w:val="22"/>
+              </w:rPr>
+              <w:t>mục</w:t>
+            </w:r>
+            <w:proofErr w:type="spellEnd"/>
+          </w:p>
+        </w:tc>
+        <w:tc>
+          <w:tcPr>
+            <w:tcW w:w="5640" w:type="dxa"/>
+            <w:gridSpan w:val="2"/>
+            <w:shd w:val="clear" w:color="auto" w:fill="F4F6F8"/>
+            <w:tcMar>
+              <w:top w:w="80" w:type="dxa"/>
+              <w:left w:w="120" w:type="dxa"/>
+              <w:bottom w:w="80" w:type="dxa"/>
+              <w:right w:w="120" w:type="dxa"/>
+            </w:tcMar>
+          </w:tcPr>
+          <w:p>
+            <w:pPr>
+              <w:spacing w:before="1200" w:after="80"/>
+              <w:jc w:val="center"/>
+              <w:rPr>
+                <w:i/>
+                <w:iCs/>
+                <w:sz w:val="22"/>
+                <w:szCs w:val="22"/>
+              </w:rPr>
+            </w:pPr>
+            <w:r>
+              <w:rPr>
+                <w:i/>
+                <w:iCs/>
+                <w:sz w:val="22"/>
+                <w:szCs w:val="22"/>
+              </w:rPr>
+              <w:drawing>
+                <wp:inline distT="0" distB="0" distL="0" distR="0" wp14:anchorId="6D5DB4CC" wp14:editId="2FA0A3E0">
+                  <wp:extent cx="3425825" cy="1651940"/>
+                  <wp:effectExtent l="0" t="0" r="3175" b="5715"/>
+                  <wp:docPr id="3" name="Picture 3"/>
+                  <wp:cNvGraphicFramePr>
+                    <a:graphicFrameLocks xmlns:a="http://schemas.openxmlformats.org/drawingml/2006/main" noChangeAspect="1"/>
+                  </wp:cNvGraphicFramePr>
+                  <a:graphic xmlns:a="http://schemas.openxmlformats.org/drawingml/2006/main">
+                    <a:graphicData uri="http://schemas.openxmlformats.org/drawingml/2006/picture">
+                      <pic:pic xmlns:pic="http://schemas.openxmlformats.org/drawingml/2006/picture">
+                        <pic:nvPicPr>
+                          <pic:cNvPr id="1" name=""/>
+                          <pic:cNvPicPr/>
+                        </pic:nvPicPr>
+                        <pic:blipFill>
+                          <a:blip r:embed="rId9"/>
+                          <a:stretch>
+                            <a:fillRect/>
+                          </a:stretch>
+                        </pic:blipFill>
+                        <pic:spPr>
+                          <a:xfrm>
+                            <a:off x="0" y="0"/>
+                            <a:ext cx="3434736" cy="1656237"/>
+                          </a:xfrm>
+                          <a:prstGeom prst="rect">
+                            <a:avLst/>
+                          </a:prstGeom>
+                        </pic:spPr>
+                      </pic:pic>
+                    </a:graphicData>
+                  </a:graphic>
+                </wp:inline>
+              </w:drawing>
+            </w:r>
           </w:p>
           <w:p>
             <w:pPr>
@@ -10074,7 +10077,6 @@
               </w:rPr>
               <w:t xml:space="preserve"> 2: </w:t>
             </w:r>
-            <w:proofErr w:type="spellStart"/>
             <w:r>
               <w:rPr>
                 <w:i/>
@@ -10082,9 +10084,9 @@
                 <w:sz w:val="22"/>
                 <w:szCs w:val="22"/>
               </w:rPr>
-              <w:t>Thiết</w:t>
-            </w:r>
-            <w:proofErr w:type="spellEnd"/>
+              <w:t xml:space="preserve">Giao </w:t>
+            </w:r>
+            <w:proofErr w:type="spellStart"/>
             <w:r>
               <w:rPr>
                 <w:i/>
@@ -10092,9 +10094,9 @@
                 <w:sz w:val="22"/>
                 <w:szCs w:val="22"/>
               </w:rPr>
-              <w:t xml:space="preserve"> </w:t>
-            </w:r>
-            <w:proofErr w:type="spellStart"/>
+              <w:t>diện</w:t>
+            </w:r>
+            <w:proofErr w:type="spellEnd"/>
             <w:r>
               <w:rPr>
                 <w:i/>
@@ -10102,9 +10104,9 @@
                 <w:sz w:val="22"/>
                 <w:szCs w:val="22"/>
               </w:rPr>
-              <w:t>kế</w:t>
-            </w:r>
-            <w:proofErr w:type="spellEnd"/>
+              <w:t xml:space="preserve"> </w:t>
+            </w:r>
+            <w:proofErr w:type="spellStart"/>
             <w:r>
               <w:rPr>
                 <w:i/>
@@ -10112,9 +10114,9 @@
                 <w:sz w:val="22"/>
                 <w:szCs w:val="22"/>
               </w:rPr>
-              <w:t xml:space="preserve"> </w:t>
-            </w:r>
-            <w:proofErr w:type="spellStart"/>
+              <w:t>trang</w:t>
+            </w:r>
+            <w:proofErr w:type="spellEnd"/>
             <w:r>
               <w:rPr>
                 <w:i/>
@@ -10122,9 +10124,9 @@
                 <w:sz w:val="22"/>
                 <w:szCs w:val="22"/>
               </w:rPr>
-              <w:t>giao</w:t>
-            </w:r>
-            <w:proofErr w:type="spellEnd"/>
+              <w:t xml:space="preserve"> </w:t>
+            </w:r>
+            <w:proofErr w:type="spellStart"/>
             <w:r>
               <w:rPr>
                 <w:i/>
@@ -10132,9 +10134,9 @@
                 <w:sz w:val="22"/>
                 <w:szCs w:val="22"/>
               </w:rPr>
-              <w:t xml:space="preserve"> </w:t>
-            </w:r>
-            <w:proofErr w:type="spellStart"/>
+              <w:t>chủ</w:t>
+            </w:r>
+            <w:proofErr w:type="spellEnd"/>
             <w:r>
               <w:rPr>
                 <w:i/>
@@ -10142,9 +10144,9 @@
                 <w:sz w:val="22"/>
                 <w:szCs w:val="22"/>
               </w:rPr>
-              <w:t>diện</w:t>
-            </w:r>
-            <w:proofErr w:type="spellEnd"/>
+              <w:t xml:space="preserve"> </w:t>
+            </w:r>
+            <w:proofErr w:type="spellStart"/>
             <w:r>
               <w:rPr>
                 <w:i/>
@@ -10152,9 +10154,9 @@
                 <w:sz w:val="22"/>
                 <w:szCs w:val="22"/>
               </w:rPr>
-              <w:t xml:space="preserve"> </w:t>
-            </w:r>
-            <w:proofErr w:type="spellStart"/>
+              <w:t>dự</w:t>
+            </w:r>
+            <w:proofErr w:type="spellEnd"/>
             <w:r>
               <w:rPr>
                 <w:i/>
@@ -10162,9 +10164,9 @@
                 <w:sz w:val="22"/>
                 <w:szCs w:val="22"/>
               </w:rPr>
-              <w:t>trên</w:t>
-            </w:r>
-            <w:proofErr w:type="spellEnd"/>
+              <w:t xml:space="preserve"> </w:t>
+            </w:r>
+            <w:proofErr w:type="spellStart"/>
             <w:r>
               <w:rPr>
                 <w:i/>
@@ -10172,8 +10174,262 @@
                 <w:sz w:val="22"/>
                 <w:szCs w:val="22"/>
               </w:rPr>
-              <w:t xml:space="preserve"> Google Stitch</w:t>
-            </w:r>
+              <w:t>tính</w:t>
+            </w:r>
+            <w:proofErr w:type="spellEnd"/>
+          </w:p>
+        </w:tc>
+      </w:tr>
+      <w:tr>
+        <w:trPr>
+          <w:trHeight w:val="4586"/>
+        </w:trPr>
+        <w:tc>
+          <w:tcPr>
+            <w:tcW w:w="9267" w:type="dxa"/>
+            <w:gridSpan w:val="2"/>
+            <w:tcBorders>
+              <w:top w:val="single" w:sz="2" w:space="0" w:color="AAB7C4"/>
+              <w:left w:val="single" w:sz="2" w:space="0" w:color="AAB7C4"/>
+              <w:bottom w:val="single" w:sz="4" w:space="0" w:color="auto"/>
+              <w:right w:val="single" w:sz="4" w:space="0" w:color="auto"/>
+            </w:tcBorders>
+            <w:shd w:val="clear" w:color="auto" w:fill="F4F6F8"/>
+            <w:tcMar>
+              <w:top w:w="80" w:type="dxa"/>
+              <w:left w:w="120" w:type="dxa"/>
+              <w:bottom w:w="80" w:type="dxa"/>
+              <w:right w:w="120" w:type="dxa"/>
+            </w:tcMar>
+          </w:tcPr>
+          <w:p>
+            <w:pPr>
+              <w:spacing w:before="1200" w:after="80"/>
+              <w:jc w:val="center"/>
+              <w:rPr>
+                <w:i/>
+                <w:iCs/>
+                <w:color w:val="AAB7C4"/>
+                <w:sz w:val="22"/>
+                <w:szCs w:val="22"/>
+              </w:rPr>
+            </w:pPr>
+            <w:r>
+              <w:rPr>
+                <w:i/>
+                <w:iCs/>
+                <w:color w:val="AAB7C4"/>
+                <w:sz w:val="22"/>
+                <w:szCs w:val="22"/>
+              </w:rPr>
+              <w:lastRenderedPageBreak/>
+              <w:drawing>
+                <wp:inline distT="0" distB="0" distL="0" distR="0" wp14:anchorId="42EF04A3" wp14:editId="4901808B">
+                  <wp:extent cx="5557974" cy="2673530"/>
+                  <wp:effectExtent l="0" t="0" r="5080" b="0"/>
+                  <wp:docPr id="6" name="Picture 6"/>
+                  <wp:cNvGraphicFramePr>
+                    <a:graphicFrameLocks xmlns:a="http://schemas.openxmlformats.org/drawingml/2006/main" noChangeAspect="1"/>
+                  </wp:cNvGraphicFramePr>
+                  <a:graphic xmlns:a="http://schemas.openxmlformats.org/drawingml/2006/main">
+                    <a:graphicData uri="http://schemas.openxmlformats.org/drawingml/2006/picture">
+                      <pic:pic xmlns:pic="http://schemas.openxmlformats.org/drawingml/2006/picture">
+                        <pic:nvPicPr>
+                          <pic:cNvPr id="1" name=""/>
+                          <pic:cNvPicPr/>
+                        </pic:nvPicPr>
+                        <pic:blipFill>
+                          <a:blip r:embed="rId10"/>
+                          <a:stretch>
+                            <a:fillRect/>
+                          </a:stretch>
+                        </pic:blipFill>
+                        <pic:spPr>
+                          <a:xfrm>
+                            <a:off x="0" y="0"/>
+                            <a:ext cx="5622618" cy="2704626"/>
+                          </a:xfrm>
+                          <a:prstGeom prst="rect">
+                            <a:avLst/>
+                          </a:prstGeom>
+                        </pic:spPr>
+                      </pic:pic>
+                    </a:graphicData>
+                  </a:graphic>
+                </wp:inline>
+              </w:drawing>
+            </w:r>
+            <w:r>
+              <w:rPr>
+                <w:i/>
+                <w:iCs/>
+                <w:color w:val="AAB7C4"/>
+                <w:sz w:val="22"/>
+                <w:szCs w:val="22"/>
+              </w:rPr>
+              <w:t xml:space="preserve"> </w:t>
+            </w:r>
+            <w:r>
+              <w:rPr>
+                <w:i/>
+                <w:iCs/>
+                <w:color w:val="AAB7C4"/>
+                <w:sz w:val="22"/>
+                <w:szCs w:val="22"/>
+              </w:rPr>
+              <w:t>[</w:t>
+            </w:r>
+            <w:proofErr w:type="spellStart"/>
+            <w:r>
+              <w:rPr>
+                <w:i/>
+                <w:iCs/>
+                <w:color w:val="AAB7C4"/>
+                <w:sz w:val="22"/>
+                <w:szCs w:val="22"/>
+              </w:rPr>
+              <w:t>Hình</w:t>
+            </w:r>
+            <w:proofErr w:type="spellEnd"/>
+            <w:r>
+              <w:rPr>
+                <w:i/>
+                <w:iCs/>
+                <w:color w:val="AAB7C4"/>
+                <w:sz w:val="22"/>
+                <w:szCs w:val="22"/>
+              </w:rPr>
+              <w:t xml:space="preserve"> </w:t>
+            </w:r>
+            <w:r>
+              <w:rPr>
+                <w:i/>
+                <w:iCs/>
+                <w:color w:val="AAB7C4"/>
+                <w:sz w:val="22"/>
+                <w:szCs w:val="22"/>
+              </w:rPr>
+              <w:t>3</w:t>
+            </w:r>
+            <w:r>
+              <w:rPr>
+                <w:i/>
+                <w:iCs/>
+                <w:color w:val="AAB7C4"/>
+                <w:sz w:val="22"/>
+                <w:szCs w:val="22"/>
+              </w:rPr>
+              <w:t xml:space="preserve">: </w:t>
+            </w:r>
+            <w:proofErr w:type="spellStart"/>
+            <w:r>
+              <w:rPr>
+                <w:i/>
+                <w:iCs/>
+                <w:color w:val="AAB7C4"/>
+                <w:sz w:val="22"/>
+                <w:szCs w:val="22"/>
+              </w:rPr>
+              <w:t>Xem</w:t>
+            </w:r>
+            <w:proofErr w:type="spellEnd"/>
+            <w:r>
+              <w:rPr>
+                <w:i/>
+                <w:iCs/>
+                <w:color w:val="AAB7C4"/>
+                <w:sz w:val="22"/>
+                <w:szCs w:val="22"/>
+              </w:rPr>
+              <w:t xml:space="preserve"> chi </w:t>
+            </w:r>
+            <w:proofErr w:type="spellStart"/>
+            <w:r>
+              <w:rPr>
+                <w:i/>
+                <w:iCs/>
+                <w:color w:val="AAB7C4"/>
+                <w:sz w:val="22"/>
+                <w:szCs w:val="22"/>
+              </w:rPr>
+              <w:t>tiết</w:t>
+            </w:r>
+            <w:proofErr w:type="spellEnd"/>
+            <w:r>
+              <w:rPr>
+                <w:i/>
+                <w:iCs/>
+                <w:color w:val="AAB7C4"/>
+                <w:sz w:val="22"/>
+                <w:szCs w:val="22"/>
+              </w:rPr>
+              <w:t xml:space="preserve"> </w:t>
+            </w:r>
+            <w:proofErr w:type="spellStart"/>
+            <w:r>
+              <w:rPr>
+                <w:i/>
+                <w:iCs/>
+                <w:color w:val="AAB7C4"/>
+                <w:sz w:val="22"/>
+                <w:szCs w:val="22"/>
+              </w:rPr>
+              <w:t>về</w:t>
+            </w:r>
+            <w:proofErr w:type="spellEnd"/>
+            <w:r>
+              <w:rPr>
+                <w:i/>
+                <w:iCs/>
+                <w:color w:val="AAB7C4"/>
+                <w:sz w:val="22"/>
+                <w:szCs w:val="22"/>
+              </w:rPr>
+              <w:t xml:space="preserve"> concert]</w:t>
+            </w:r>
+          </w:p>
+        </w:tc>
+        <w:tc>
+          <w:tcPr>
+            <w:tcW w:w="260" w:type="dxa"/>
+            <w:gridSpan w:val="2"/>
+            <w:tcBorders>
+              <w:top w:val="nil"/>
+              <w:left w:val="single" w:sz="4" w:space="0" w:color="auto"/>
+              <w:bottom w:val="nil"/>
+              <w:right w:val="nil"/>
+            </w:tcBorders>
+            <w:shd w:val="clear" w:color="auto" w:fill="F4F6F8"/>
+            <w:tcMar>
+              <w:top w:w="80" w:type="dxa"/>
+              <w:left w:w="120" w:type="dxa"/>
+              <w:bottom w:w="80" w:type="dxa"/>
+              <w:right w:w="120" w:type="dxa"/>
+            </w:tcMar>
+          </w:tcPr>
+          <w:p>
+            <w:pPr>
+              <w:spacing w:before="1200" w:after="80"/>
+              <w:jc w:val="center"/>
+              <w:rPr>
+                <w:i/>
+                <w:iCs/>
+                <w:sz w:val="22"/>
+                <w:szCs w:val="22"/>
+              </w:rPr>
+            </w:pPr>
+          </w:p>
+          <w:p>
+            <w:pPr>
+              <w:spacing w:before="1200" w:after="80"/>
+              <w:jc w:val="center"/>
+              <w:rPr>
+                <w:i/>
+                <w:iCs/>
+                <w:sz w:val="22"/>
+                <w:szCs w:val="22"/>
+              </w:rPr>
+            </w:pPr>
           </w:p>
         </w:tc>
       </w:tr>
@@ -11170,7 +11426,6 @@
                 <w:sz w:val="24"/>
                 <w:szCs w:val="24"/>
               </w:rPr>
-              <w:lastRenderedPageBreak/>
               <w:t>2</w:t>
             </w:r>
           </w:p>
@@ -13317,7 +13572,10 @@
             </w:r>
             <w:proofErr w:type="spellEnd"/>
             <w:r>
-              <w:t xml:space="preserve"> run dev</w:t>
+              <w:t xml:space="preserve"> </w:t>
+            </w:r>
+            <w:r>
+              <w:t>start</w:t>
             </w:r>
           </w:p>
         </w:tc>
@@ -13542,15 +13800,7 @@
               <w:right w:w="120" w:type="dxa"/>
             </w:tcMar>
           </w:tcPr>
-          <w:p>
-            <w:r>
-              <w:rPr>
-                <w:sz w:val="24"/>
-                <w:szCs w:val="24"/>
-              </w:rPr>
-              <w:t>3</w:t>
-            </w:r>
-          </w:p>
+          <w:p/>
         </w:tc>
         <w:tc>
           <w:tcPr>
@@ -13569,49 +13819,7 @@
               <w:right w:w="120" w:type="dxa"/>
             </w:tcMar>
           </w:tcPr>
-          <w:p>
-            <w:r>
-              <w:t xml:space="preserve">Port 5173 </w:t>
-            </w:r>
-            <w:proofErr w:type="spellStart"/>
-            <w:r>
-              <w:t>bị</w:t>
-            </w:r>
-            <w:proofErr w:type="spellEnd"/>
-            <w:r>
-              <w:t xml:space="preserve"> </w:t>
-            </w:r>
-            <w:proofErr w:type="spellStart"/>
-            <w:r>
-              <w:t>chiếm</w:t>
-            </w:r>
-            <w:proofErr w:type="spellEnd"/>
-            <w:r>
-              <w:t xml:space="preserve">, </w:t>
-            </w:r>
-            <w:proofErr w:type="spellStart"/>
-            <w:r>
-              <w:t>Vite</w:t>
-            </w:r>
-            <w:proofErr w:type="spellEnd"/>
-            <w:r>
-              <w:t xml:space="preserve"> </w:t>
-            </w:r>
-            <w:proofErr w:type="spellStart"/>
-            <w:r>
-              <w:t>báo</w:t>
-            </w:r>
-            <w:proofErr w:type="spellEnd"/>
-            <w:r>
-              <w:t xml:space="preserve"> </w:t>
-            </w:r>
-            <w:r>
-              <w:rPr>
-                <w:rStyle w:val="HTMLCode"/>
-              </w:rPr>
-              <w:t>Port 5173 is in use</w:t>
-            </w:r>
-          </w:p>
+          <w:p/>
         </w:tc>
         <w:tc>
           <w:tcPr>
@@ -13630,56 +13838,7 @@
               <w:right w:w="120" w:type="dxa"/>
             </w:tcMar>
           </w:tcPr>
-          <w:p>
-            <w:proofErr w:type="spellStart"/>
-            <w:r>
-              <w:t>Một</w:t>
-            </w:r>
-            <w:proofErr w:type="spellEnd"/>
-            <w:r>
-              <w:t xml:space="preserve"> process </w:t>
-            </w:r>
-            <w:proofErr w:type="spellStart"/>
-            <w:r>
-              <w:t>cũ</w:t>
-            </w:r>
-            <w:proofErr w:type="spellEnd"/>
-            <w:r>
-              <w:t xml:space="preserve"> </w:t>
-            </w:r>
-            <w:proofErr w:type="spellStart"/>
-            <w:r>
-              <w:t>chưa</w:t>
-            </w:r>
-            <w:proofErr w:type="spellEnd"/>
-            <w:r>
-              <w:t xml:space="preserve"> </w:t>
-            </w:r>
-            <w:proofErr w:type="spellStart"/>
-            <w:r>
-              <w:t>tắt</w:t>
-            </w:r>
-            <w:proofErr w:type="spellEnd"/>
-            <w:r>
-              <w:t xml:space="preserve"> </w:t>
-            </w:r>
-            <w:proofErr w:type="spellStart"/>
-            <w:r>
-              <w:t>đang</w:t>
-            </w:r>
-            <w:proofErr w:type="spellEnd"/>
-            <w:r>
-              <w:t xml:space="preserve"> </w:t>
-            </w:r>
-            <w:proofErr w:type="spellStart"/>
-            <w:r>
-              <w:t>giữ</w:t>
-            </w:r>
-            <w:proofErr w:type="spellEnd"/>
-            <w:r>
-              <w:t xml:space="preserve"> port</w:t>
-            </w:r>
-          </w:p>
+          <w:p/>
         </w:tc>
         <w:tc>
           <w:tcPr>
@@ -13698,21 +13857,7 @@
               <w:right w:w="120" w:type="dxa"/>
             </w:tcMar>
           </w:tcPr>
-          <w:p>
-            <w:proofErr w:type="spellStart"/>
-            <w:r>
-              <w:t>Tắt</w:t>
-            </w:r>
-            <w:proofErr w:type="spellEnd"/>
-            <w:r>
-              <w:t xml:space="preserve"> process </w:t>
-            </w:r>
-            <w:proofErr w:type="spellStart"/>
-            <w:r>
-              <w:t>cũ</w:t>
-            </w:r>
-            <w:proofErr w:type="spellEnd"/>
-          </w:p>
+          <w:p/>
         </w:tc>
         <w:tc>
           <w:tcPr>
@@ -13731,16 +13876,7 @@
               <w:right w:w="120" w:type="dxa"/>
             </w:tcMar>
           </w:tcPr>
-          <w:p>
-            <w:proofErr w:type="spellStart"/>
-            <w:r>
-              <w:t>Đã</w:t>
-            </w:r>
-            <w:proofErr w:type="spellEnd"/>
-            <w:r>
-              <w:t xml:space="preserve"> fix</w:t>
-            </w:r>
-          </w:p>
+          <w:p/>
         </w:tc>
       </w:tr>
     </w:tbl>
@@ -14079,8 +14215,8 @@
       </w:pPr>
     </w:p>
     <w:sectPr>
-      <w:headerReference w:type="default" r:id="rId9"/>
-      <w:footerReference w:type="default" r:id="rId10"/>
+      <w:headerReference w:type="default" r:id="rId11"/>
+      <w:footerReference w:type="default" r:id="rId12"/>
       <w:pgSz w:w="11906" w:h="16838"/>
       <w:pgMar w:top="1134" w:right="850" w:bottom="1134" w:left="1701" w:header="708" w:footer="708" w:gutter="0"/>
       <w:cols w:space="720"/>
@@ -14271,7 +14407,7 @@
         <w:sz w:val="20"/>
         <w:szCs w:val="20"/>
       </w:rPr>
-      <w:t>ReadMore</w:t>
+      <w:t>TicketNow</w:t>
     </w:r>
     <w:proofErr w:type="spellEnd"/>
     <w:r>
@@ -14282,7 +14418,7 @@
         <w:sz w:val="20"/>
         <w:szCs w:val="20"/>
       </w:rPr>
-      <w:t xml:space="preserve"> Bookstore — </w:t>
+      <w:t xml:space="preserve"> — </w:t>
     </w:r>
     <w:proofErr w:type="spellStart"/>
     <w:r>
@@ -15301,6 +15437,48 @@
     <w:basedOn w:val="DefaultParagraphFont"/>
     <w:rsid w:val="00D415F2"/>
   </w:style>
+  <w:style w:type="paragraph" w:styleId="Header">
+    <w:name w:val="header"/>
+    <w:basedOn w:val="Normal"/>
+    <w:link w:val="HeaderChar"/>
+    <w:uiPriority w:val="99"/>
+    <w:unhideWhenUsed/>
+    <w:rsid w:val="00727473"/>
+    <w:pPr>
+      <w:tabs>
+        <w:tab w:val="center" w:pos="4680"/>
+        <w:tab w:val="right" w:pos="9360"/>
+      </w:tabs>
+    </w:pPr>
+  </w:style>
+  <w:style w:type="character" w:customStyle="1" w:styleId="HeaderChar">
+    <w:name w:val="Header Char"/>
+    <w:basedOn w:val="DefaultParagraphFont"/>
+    <w:link w:val="Header"/>
+    <w:uiPriority w:val="99"/>
+    <w:rsid w:val="00727473"/>
+  </w:style>
+  <w:style w:type="paragraph" w:styleId="Footer">
+    <w:name w:val="footer"/>
+    <w:basedOn w:val="Normal"/>
+    <w:link w:val="FooterChar"/>
+    <w:uiPriority w:val="99"/>
+    <w:unhideWhenUsed/>
+    <w:rsid w:val="00727473"/>
+    <w:pPr>
+      <w:tabs>
+        <w:tab w:val="center" w:pos="4680"/>
+        <w:tab w:val="right" w:pos="9360"/>
+      </w:tabs>
+    </w:pPr>
+  </w:style>
+  <w:style w:type="character" w:customStyle="1" w:styleId="FooterChar">
+    <w:name w:val="Footer Char"/>
+    <w:basedOn w:val="DefaultParagraphFont"/>
+    <w:link w:val="Footer"/>
+    <w:uiPriority w:val="99"/>
+    <w:rsid w:val="00727473"/>
+  </w:style>
 </w:styles>
 </file>
 
@@ -15597,4 +15775,16 @@
     </a:ext>
   </a:extLst>
 </a:theme>
+</file>
+
+<file path=customXml/item1.xml><?xml version="1.0" encoding="utf-8"?>
+<b:Sources xmlns:b="http://schemas.openxmlformats.org/officeDocument/2006/bibliography" xmlns="http://schemas.openxmlformats.org/officeDocument/2006/bibliography" SelectedStyle="\APASixthEditionOfficeOnline.xsl" StyleName="APA" Version="6"/>
+</file>
+
+<file path=customXml/itemProps1.xml><?xml version="1.0" encoding="utf-8"?>
+<ds:datastoreItem xmlns:ds="http://schemas.openxmlformats.org/officeDocument/2006/customXml" ds:itemID="{F2472E8A-3B68-4979-B180-E63298EFC719}">
+  <ds:schemaRefs>
+    <ds:schemaRef ds:uri="http://schemas.openxmlformats.org/officeDocument/2006/bibliography"/>
+  </ds:schemaRefs>
+</ds:datastoreItem>
 </file>
</xml_diff>